<commit_message>
Update clinician reports based on latest feedback
</commit_message>
<xml_diff>
--- a/pci_clinician_report/style_template.docx
+++ b/pci_clinician_report/style_template.docx
@@ -121,6 +121,14 @@
     <w:p>
       <w:r>
         <w:t>Normal text</w:t>
+      </w:r>
+    </w:p>
+    <w:p>
+      <w:pPr>
+        <w:pStyle w:val="NormalSize10"/>
+      </w:pPr>
+      <w:r>
+        <w:t>Font size 10 text</w:t>
       </w:r>
     </w:p>
     <w:p>
@@ -1954,6 +1962,26 @@
     <w:rPr>
       <w:rFonts w:ascii="Arial" w:hAnsi="Arial"/>
       <w:sz w:val="22"/>
+    </w:rPr>
+  </w:style>
+  <w:style w:type="paragraph" w:customStyle="1" w:styleId="NormalSize10">
+    <w:name w:val="Normal (Size 10)"/>
+    <w:basedOn w:val="Normal"/>
+    <w:link w:val="NormalSize10Char"/>
+    <w:qFormat/>
+    <w:rsid w:val="00137F02"/>
+    <w:rPr>
+      <w:sz w:val="20"/>
+    </w:rPr>
+  </w:style>
+  <w:style w:type="character" w:customStyle="1" w:styleId="NormalSize10Char">
+    <w:name w:val="Normal (Size 10) Char"/>
+    <w:basedOn w:val="DefaultParagraphFont"/>
+    <w:link w:val="NormalSize10"/>
+    <w:rsid w:val="00137F02"/>
+    <w:rPr>
+      <w:rFonts w:ascii="Arial" w:hAnsi="Arial"/>
+      <w:sz w:val="20"/>
     </w:rPr>
   </w:style>
 </w:styles>

</xml_diff>